<commit_message>
chore: establish architecture-frozen baseline
Baseline-Whitespace-Waiver: WP-00A
Historical artifact provenance: WP-00C/WP-00D
No runtime, HIL, or real-robot evidence is claimed.
</commit_message>
<xml_diff>
--- a/docs/MECANUM_NAV_DRL_Architecture.docx
+++ b/docs/MECANUM_NAV_DRL_Architecture.docx
@@ -3093,6 +3093,38 @@
           </w:p>
         </w:tc>
       </w:tr>
+      <w:tr>
+        <w:tc>
+          <w:tcPr>
+            <w:tcW w:type="dxa" w:w="3324"/>
+          </w:tcPr>
+          <w:p>
+            <w:r>
+              <w:t>D13</w:t>
+            </w:r>
+          </w:p>
+        </w:tc>
+        <w:tc>
+          <w:tcPr>
+            <w:tcW w:type="dxa" w:w="3324"/>
+          </w:tcPr>
+          <w:p>
+            <w:r>
+              <w:t>sim_train dùng hidden GT -&gt; SimulatedOdometryEmulator nội bộ -&gt; noisy pose/twist snapshot; GT bị cấm khỏi policy; MVP không public odometry/TF; ACR S1</w:t>
+            </w:r>
+          </w:p>
+        </w:tc>
+        <w:tc>
+          <w:tcPr>
+            <w:tcW w:type="dxa" w:w="3324"/>
+          </w:tcPr>
+          <w:p>
+            <w:r>
+              <w:t>FIXED_ARCH</w:t>
+            </w:r>
+          </w:p>
+        </w:tc>
+      </w:tr>
     </w:tbl>
     <w:p>
       <w:r/>
@@ -3158,7 +3190,7 @@
         <w:spacing w:after="40"/>
       </w:pPr>
       <w:r>
-        <w:t>Ground truth chỉ vào TrainingTaskOracle/evaluator theo profile; PolicyNode và ObservationEncoder không subscribe /ground_truth/odom và không nhận world pose.</w:t>
+        <w:t>Ground truth chỉ vào SimulatedOdometryEmulator nội bộ, TrainingTaskOracle, reset transaction/validation, reward, success/termination và evaluator theo profile. PolicyNode, ObservationEncoder, SnapshotSynchronizer và policy runtime không subscribe /ground_truth/odom, không nhận Gazebo world/model pose và không nhận raw GT buffer/object. ACR S1 Simulated Odometry And Ground Truth Isolation là quyết định áp dụng cho sim_train.</w:t>
       </w:r>
     </w:p>
     <w:p>
@@ -6874,16 +6906,8 @@
             </w:tcMar>
           </w:tcPr>
           <w:p>
-            <w:pPr>
-              <w:spacing w:after="0" w:before="0"/>
-            </w:pPr>
-            <w:r/>
-            <w:r>
-              <w:rPr>
-                <w:b w:val="0"/>
-                <w:sz w:val="16"/>
-              </w:rPr>
-              <w:t>noisy simulated odom</w:t>
+            <w:r>
+              <w:t>internal SimulatedOdometryEmulator noisy pose/twist snapshot; no public topic</w:t>
             </w:r>
           </w:p>
         </w:tc>
@@ -7006,16 +7030,8 @@
             <w:shd w:fill="EAF2F8"/>
           </w:tcPr>
           <w:p>
-            <w:pPr>
-              <w:spacing w:after="0" w:before="0"/>
-            </w:pPr>
-            <w:r/>
-            <w:r>
-              <w:rPr>
-                <w:b w:val="0"/>
-                <w:sz w:val="16"/>
-              </w:rPr>
-              <w:t>GT allowed outside observation</w:t>
+            <w:r>
+              <w:t>GT allowed only in hidden emulator, task oracle, reset validation, reward/success/termination/evaluator</w:t>
             </w:r>
           </w:p>
         </w:tc>
@@ -7404,16 +7420,8 @@
             </w:tcMar>
           </w:tcPr>
           <w:p>
-            <w:pPr>
-              <w:spacing w:after="0" w:before="0"/>
-            </w:pPr>
-            <w:r/>
-            <w:r>
-              <w:rPr>
-                <w:b w:val="0"/>
-                <w:sz w:val="16"/>
-              </w:rPr>
-              <w:t>forbidden</w:t>
+            <w:r>
+              <w:t>forbidden: GT topic, world/model pose, raw GT buffer/object</w:t>
             </w:r>
           </w:p>
         </w:tc>
@@ -7536,16 +7544,8 @@
             <w:shd w:fill="EAF2F8"/>
           </w:tcPr>
           <w:p>
-            <w:pPr>
-              <w:spacing w:after="0" w:before="0"/>
-            </w:pPr>
-            <w:r/>
-            <w:r>
-              <w:rPr>
-                <w:b w:val="0"/>
-                <w:sz w:val="16"/>
-              </w:rPr>
-              <w:t>train distribution</w:t>
+            <w:r>
+              <w:t>episode-seeded bias/yaw bias, drift, velocity noise, delay queue, dropout; manifest required</w:t>
             </w:r>
           </w:p>
         </w:tc>
@@ -9221,7 +9221,7 @@
           </w:tcPr>
           <w:p>
             <w:r>
-              <w:t>TrainingTaskOracle/evaluator only</w:t>
+              <w:t>SimulatedOdometryEmulator internal; TrainingTaskOracle; reset transaction/validation; reward/success/termination; evaluator. Never PolicyNode/ObservationEncoder/policy runtime.</w:t>
             </w:r>
           </w:p>
         </w:tc>
@@ -9233,7 +9233,7 @@
           </w:tcPr>
           <w:p>
             <w:r>
-              <w:t>sim only</w:t>
+              <w:t>sim only; hidden from policy</w:t>
             </w:r>
           </w:p>
         </w:tc>
@@ -12001,16 +12001,8 @@
             </w:tcMar>
           </w:tcPr>
           <w:p>
-            <w:pPr>
-              <w:spacing w:after="0" w:before="0"/>
-            </w:pPr>
-            <w:r/>
-            <w:r>
-              <w:rPr>
-                <w:b w:val="0"/>
-                <w:sz w:val="16"/>
-              </w:rPr>
-              <w:t>noisy odom/local goal; GT oracle separate</w:t>
+            <w:r>
+              <w:t>internal noisy snapshot/local goal; GT hidden emulator + oracle separate</w:t>
             </w:r>
           </w:p>
         </w:tc>
@@ -12026,16 +12018,8 @@
             </w:tcMar>
           </w:tcPr>
           <w:p>
-            <w:pPr>
-              <w:spacing w:after="0" w:before="0"/>
-            </w:pPr>
-            <w:r/>
-            <w:r>
-              <w:rPr>
-                <w:b w:val="0"/>
-                <w:sz w:val="16"/>
-              </w:rPr>
-              <w:t>odom-&gt;base_link; base_link-&gt;sim_lidar</w:t>
+            <w:r>
+              <w:t>base_link-&gt;sim_lidar; no new odom-&gt;base_link publisher in MVP</w:t>
             </w:r>
           </w:p>
         </w:tc>
@@ -12051,16 +12035,8 @@
             </w:tcMar>
           </w:tcPr>
           <w:p>
-            <w:pPr>
-              <w:spacing w:after="0" w:before="0"/>
-            </w:pPr>
-            <w:r/>
-            <w:r>
-              <w:rPr>
-                <w:b w:val="0"/>
-                <w:sz w:val="16"/>
-              </w:rPr>
-              <w:t>sim odom adapter; robot_state_publisher</w:t>
+            <w:r>
+              <w:t>robot_state_publisher; sim_train odom-&gt;base_link authority deferred to reconciliation</w:t>
             </w:r>
           </w:p>
         </w:tc>
@@ -12565,16 +12541,8 @@
             </w:tcMar>
           </w:tcPr>
           <w:p>
-            <w:pPr>
-              <w:spacing w:after="0" w:before="0"/>
-            </w:pPr>
-            <w:r/>
-            <w:r>
-              <w:rPr>
-                <w:b w:val="0"/>
-                <w:sz w:val="16"/>
-              </w:rPr>
-              <w:t>noisy simulated odometry</w:t>
+            <w:r>
+              <w:t>internal SimulatedOdometryEmulator noisy snapshot</w:t>
             </w:r>
           </w:p>
         </w:tc>
@@ -12590,16 +12558,8 @@
             </w:tcMar>
           </w:tcPr>
           <w:p>
-            <w:pPr>
-              <w:spacing w:after="0" w:before="0"/>
-            </w:pPr>
-            <w:r/>
-            <w:r>
-              <w:rPr>
-                <w:b w:val="0"/>
-                <w:sz w:val="16"/>
-              </w:rPr>
-              <w:t>/ground_truth/odom for reward/metrics only</w:t>
+            <w:r>
+              <w:t>/ground_truth/odom only for hidden emulator, oracle, reset validation, reward/success/termination/evaluator</w:t>
             </w:r>
           </w:p>
         </w:tc>
@@ -12615,16 +12575,8 @@
             </w:tcMar>
           </w:tcPr>
           <w:p>
-            <w:pPr>
-              <w:spacing w:after="0" w:before="0"/>
-            </w:pPr>
-            <w:r/>
-            <w:r>
-              <w:rPr>
-                <w:b w:val="0"/>
-                <w:sz w:val="16"/>
-              </w:rPr>
-              <w:t>not subscribed by PolicyNode/ObservationEncoder</w:t>
+            <w:r>
+              <w:t>not subscribed by PolicyNode/ObservationEncoder/policy runtime; no world/model pose or raw GT object</w:t>
             </w:r>
           </w:p>
         </w:tc>
@@ -12971,7 +12923,7 @@
         <w:spacing w:after="40"/>
       </w:pPr>
       <w:r>
-        <w:t>sim_train tính goal-relative numerically từ pose và goal cùng world; không cần world trong TF graph và không tạo parent thứ hai của base_link.</w:t>
+        <w:t>sim_train dùng output noisy pose/twist nội bộ của SimulatedOdometryEmulator cho local goal; ground truth chỉ là input ẩn của emulator và task oracle. MVP không tạo public odometry topic hay TF publisher mới và không tạo parent thứ hai của base_link.</w:t>
       </w:r>
     </w:p>
     <w:p>
@@ -20360,6 +20312,14 @@
     </w:p>
     <w:p>
       <w:pPr>
+        <w:pStyle w:val="ListBullet"/>
+      </w:pPr>
+      <w:r>
+        <w:t>ACR S1 required tests: policy observation accepts only emulator output; graph/config forbids PolicyNode/ObservationEncoder subscription to /ground_truth/odom; reset clears bias/drift/delay queue by episode seed; equal seed plus parameter manifest and input trace is reproducible; MecanumDrive /odom is not declared policy odometry.</w:t>
+      </w:r>
+    </w:p>
+    <w:p>
+      <w:pPr>
         <w:pStyle w:val="Heading1"/>
         <w:keepNext/>
         <w:spacing w:before="200" w:after="100"/>
@@ -24218,6 +24178,46 @@
       </w:pPr>
       <w:r>
         <w:t>artifacts/hardware/&lt;hardware_profile_id&gt;/hardware_manifest.yaml là nguồn chuẩn duy nhất cho wheel order, dấu, bán kính bánh, wheelbase, track, encoder CPR và gear ratio. wheel_geometry.yaml và firmware kinematics_params.h được sinh hoặc xác minh từ manifest; bridge so sánh hardware_config_hash với hash firmware trước khi enable motor.</w:t>
+      </w:r>
+    </w:p>
+    <w:p>
+      <w:pPr>
+        <w:pStyle w:val="Heading2"/>
+      </w:pPr>
+      <w:r>
+        <w:t>41.1 Simulated odometry và ground-truth isolation cho sim_train</w:t>
+      </w:r>
+    </w:p>
+    <w:p>
+      <w:pPr>
+        <w:pStyle w:val="ListBullet"/>
+      </w:pPr>
+      <w:r>
+        <w:t>sim_train canonical data flow: hidden Gazebo ground truth -&gt; SimulatedOdometryEmulator nội bộ -&gt; noisy pose/twist snapshot -&gt; SnapshotSynchronizer -&gt; ObservationEncoder -&gt; PPO. MVP output là internal typed snapshot, không public nav_msgs/Odometry và không publish TF.</w:t>
+      </w:r>
+    </w:p>
+    <w:p>
+      <w:pPr>
+        <w:pStyle w:val="ListBullet"/>
+      </w:pPr>
+      <w:r>
+        <w:t>Noise MVP bắt buộc có position/yaw bias theo episode, random-walk drift, velocity noise, delay queue và dropout. Reset xóa state emulator theo episode seed; sampled parameter manifest phải được lưu để tái lập.</w:t>
+      </w:r>
+    </w:p>
+    <w:p>
+      <w:pPr>
+        <w:pStyle w:val="ListBullet"/>
+      </w:pPr>
+      <w:r>
+        <w:t>MecanumDrive /odom là legacy compatibility/wheel-visualization/odom path, không phải actuator chính thức hay policy odometry canonical. VelocityControl là intended model-motion actuator của legacy simulation; Gazebo actuator, /odom và TF reconciliation là deferred work.</w:t>
+      </w:r>
+    </w:p>
+    <w:p>
+      <w:pPr>
+        <w:pStyle w:val="ListBullet"/>
+      </w:pPr>
+      <w:r>
+        <w:t>sim_eval/deploy_sim target: encoder emulator -&gt; simulated /wheel/odometry_raw equivalent -&gt; EKF -&gt; /odometry/filtered. deploy_real target: STM32 encoder ticks -&gt; /wheel/odometry_raw -&gt; EKF. EKF là odom-&gt;base_link authority duy nhất trong integration/deployment profiles.</w:t>
       </w:r>
     </w:p>
     <w:p>
@@ -25027,7 +25027,7 @@
         <w:spacing w:after="40"/>
       </w:pPr>
       <w:r>
-        <w:t>TF/estimation: single map-&gt;odom, single odom-&gt;base_link, no world-&gt;base_link GT TF, wheel order/sign/counter wrap/packet loss/MCU reboot tests, no GT measured twist.</w:t>
+        <w:t>TF/estimation: single map-&gt;odom, single odom-&gt;base_link theo profile integration/deployment, no world-&gt;base_link GT TF, wheel order/sign/counter wrap/packet loss/MCU reboot tests; sim_train MVP không tạo TF authority mới và policy không dùng GT measured twist.</w:t>
       </w:r>
     </w:p>
     <w:p>
@@ -25063,7 +25063,7 @@
         <w:spacing w:after="40"/>
       </w:pPr>
       <w:r>
-        <w:t>Evaluation: same approved map, goals, scenarios, seeds and hard safety envelope for Nav2 baseline and hybrid; sealed splits; ground truth cannot influence policy.</w:t>
+        <w:t>Evaluation: same approved map, goals, scenarios, seeds and hard safety envelope for Nav2 baseline and hybrid; sealed splits; ground truth cannot influence policy. sim_train phải chứng minh ground-truth isolation, episode-seed reset của bias/drift/delay queue và reproducibility của sampled-parameter manifest.</w:t>
       </w:r>
     </w:p>
     <w:p>
@@ -25090,7 +25090,7 @@
         <w:spacing w:after="40"/>
       </w:pPr>
       <w:r>
-        <w:t>Không còn frame contradiction; mọi profile có pose source, goal frame và TF authority duy nhất.</w:t>
+        <w:t>Không còn frame contradiction; mọi profile có pose source, goal frame và TF authority duy nhất. sim_train MVP dùng internal SimulatedOdometryEmulator snapshot và chưa thêm TF authority mới.</w:t>
       </w:r>
     </w:p>
     <w:p>
@@ -25180,7 +25180,7 @@
         <w:spacing w:after="40"/>
       </w:pPr>
       <w:r>
-        <w:t>Phase 3: finish core env/observation/action/reward/termination/reset and Gate 1.</w:t>
+        <w:t>Phase 3: implement simulator adapter gồm SimulatedOdometryEmulator nội bộ, transactional reset, ground-truth isolation tests, core env/observation/action/reward/termination và Gate 1.</w:t>
       </w:r>
     </w:p>
     <w:p>
@@ -25315,6 +25315,8 @@
         <w:t>ground_truth_policy_access: false</w:t>
         <w:br/>
         <w:t>ground_truth_task_oracle_access: true</w:t>
+        <w:br/>
+        <w:t>simulated_odometry: {output: internal_typed_snapshot, public_topic: none, tf_publisher: none, reset: episode_seed, parameter_manifest: required}</w:t>
         <w:br/>
         <w:t>lidar: {model: RPLIDAR_A1M8_SIM, frame: RPLiDAR_A1M8_1, sectors: 72}</w:t>
         <w:br/>

</xml_diff>

<commit_message>
docs: define RFC 8785 map hash serialization
</commit_message>
<xml_diff>
--- a/docs/MECANUM_NAV_DRL_Architecture.docx
+++ b/docs/MECANUM_NAV_DRL_Architecture.docx
@@ -24939,7 +24939,7 @@
         <w:spacing w:after="40"/>
       </w:pPr>
       <w:r>
-        <w:t>map_content_hash là SHA-256 của canonical JSON trong map_manifest.json, gồm role, relative filename, size và SHA-256 của raw map.yaml và map.pgm. pose_graph_manifest.json dùng schema/hash riêng; metadata.yaml không tự nằm trong hash mà nó lưu.</w:t>
+        <w:t>map_content_hash là SHA-256 của đúng chuỗi bytes do RFC 8785 JSON Canonicalization Scheme (JCS) tạo từ projection map_hash_manifest, được encode UTF-8 không BOM và không có trailing newline. Projection chỉ gồm schema cùng hai file entry map.yaml và map.pgm theo thứ tự map_yaml rồi occupancy_image; mỗi entry có role, relative name, size_bytes và SHA-256 của raw file bytes. Raw-file SHA-256 khác với map_content_hash. metadata.yaml, pose graph tùy chọn, manifest result fields và map_content_hash kết quả không thuộc payload được băm. pose_graph_manifest.json dùng schema/hash riêng.</w:t>
       </w:r>
     </w:p>
     <w:p>
@@ -24963,15 +24963,15 @@
         <w:br/>
         <w:t xml:space="preserve">  files: [</w:t>
         <w:br/>
-        <w:t xml:space="preserve">    {role: map_yaml, name, size_bytes, sha256},</w:t>
-        <w:br/>
-        <w:t xml:space="preserve">    {role: occupancy_image, name, size_bytes, sha256}</w:t>
+        <w:t xml:space="preserve">    {role: map_yaml, name: map.yaml, size_bytes, sha256},</w:t>
+        <w:br/>
+        <w:t xml:space="preserve">    {role: occupancy_image, name: map.pgm, size_bytes, sha256}</w:t>
         <w:br/>
         <w:t xml:space="preserve">  ]</w:t>
         <w:br/>
         <w:t>}</w:t>
         <w:br/>
-        <w:t>map_content_hash = SHA256(canonical_json(map_hash_manifest))</w:t>
+        <w:t>map_content_hash = SHA256(RFC 8785 JCS UTF-8 bytes; no BOM or trailing newline)</w:t>
       </w:r>
     </w:p>
     <w:p>

</xml_diff>